<commit_message>
refactor: update portfolio data with refined experience descriptions and project summaries
</commit_message>
<xml_diff>
--- a/public/resume/Zihong_Liang_CV.docx
+++ b/public/resume/Zihong_Liang_CV.docx
@@ -484,7 +484,117 @@
           <w:szCs w:val="20"/>
           <w14:ligatures w14:val="none"/>
         </w:rPr>
-        <w:t>A high-achieving Computer Science graduate (GPA 7.1/9) with proven experience in full-stack development, system architecture, and AI integrations. Skilled in building scalable applications and RESTful APIs using TypeScript, Python, and C#. Strong foundation in Agile methodologies and DevOps practices (Docker, CI/CD pipelines, Git). Recognised for leadership, rapid adaptation to emerging technologies, and delivering performant, user-centric solutions.</w:t>
+        <w:t xml:space="preserve">A high-achieving Computer Science graduate (GPA 7.1/9) with proven experience in full-stack development, system architecture, and AI integrations. Skilled in building scalable applications and RESTful APIs using TypeScript, Python, and C#. Strong foundation in Agile methodologies and DevOps practices (Docker, CI/CD pipelines, Git). Recognised for leadership, </w:t>
+      </w:r>
+      <w:r>
+        <w:rPr>
+          <w:rFonts w:eastAsia="Times New Roman" w:cs="Times New Roman"/>
+          <w:color w:val="000000"/>
+          <w:kern w:val="0"/>
+          <w:sz w:val="20"/>
+          <w:szCs w:val="20"/>
+          <w14:ligatures w14:val="none"/>
+        </w:rPr>
+        <w:t>proven abilit</w:t>
+      </w:r>
+      <w:r>
+        <w:rPr>
+          <w:rFonts w:eastAsia="Times New Roman" w:cs="Times New Roman"/>
+          <w:color w:val="000000"/>
+          <w:kern w:val="0"/>
+          <w:sz w:val="20"/>
+          <w:szCs w:val="20"/>
+          <w14:ligatures w14:val="none"/>
+        </w:rPr>
+        <w:t>ies</w:t>
+      </w:r>
+      <w:r>
+        <w:rPr>
+          <w:rFonts w:eastAsia="Times New Roman" w:cs="Times New Roman"/>
+          <w:color w:val="000000"/>
+          <w:kern w:val="0"/>
+          <w:sz w:val="20"/>
+          <w:szCs w:val="20"/>
+          <w14:ligatures w14:val="none"/>
+        </w:rPr>
+        <w:t xml:space="preserve"> to rapidly master new tech stacks</w:t>
+      </w:r>
+      <w:r>
+        <w:rPr>
+          <w:rFonts w:eastAsia="Times New Roman" w:cs="Times New Roman"/>
+          <w:color w:val="000000"/>
+          <w:kern w:val="0"/>
+          <w:sz w:val="20"/>
+          <w:szCs w:val="20"/>
+          <w14:ligatures w14:val="none"/>
+        </w:rPr>
+        <w:t xml:space="preserve"> with recent </w:t>
+      </w:r>
+      <w:r>
+        <w:rPr>
+          <w:rFonts w:eastAsia="Times New Roman" w:cs="Times New Roman"/>
+          <w:color w:val="000000"/>
+          <w:kern w:val="0"/>
+          <w:sz w:val="20"/>
+          <w:szCs w:val="20"/>
+          <w14:ligatures w14:val="none"/>
+        </w:rPr>
+        <w:t>exploration</w:t>
+      </w:r>
+      <w:r>
+        <w:rPr>
+          <w:rFonts w:eastAsia="Times New Roman" w:cs="Times New Roman"/>
+          <w:color w:val="000000"/>
+          <w:kern w:val="0"/>
+          <w:sz w:val="20"/>
+          <w:szCs w:val="20"/>
+          <w14:ligatures w14:val="none"/>
+        </w:rPr>
+        <w:t xml:space="preserve"> in </w:t>
+      </w:r>
+      <w:r>
+        <w:rPr>
+          <w:rFonts w:eastAsia="Times New Roman" w:cs="Times New Roman"/>
+          <w:color w:val="000000"/>
+          <w:kern w:val="0"/>
+          <w:sz w:val="20"/>
+          <w:szCs w:val="20"/>
+          <w14:ligatures w14:val="none"/>
+        </w:rPr>
+        <w:t>Go</w:t>
+      </w:r>
+      <w:r>
+        <w:rPr>
+          <w:rFonts w:eastAsia="Times New Roman" w:cs="Times New Roman"/>
+          <w:color w:val="000000"/>
+          <w:kern w:val="0"/>
+          <w:sz w:val="20"/>
+          <w:szCs w:val="20"/>
+          <w14:ligatures w14:val="none"/>
+        </w:rPr>
+        <w:t xml:space="preserve">, </w:t>
+      </w:r>
+      <w:r>
+        <w:rPr>
+          <w:rFonts w:eastAsia="Times New Roman" w:cs="Times New Roman"/>
+          <w:color w:val="000000"/>
+          <w:kern w:val="0"/>
+          <w:sz w:val="20"/>
+          <w:szCs w:val="20"/>
+          <w14:ligatures w14:val="none"/>
+        </w:rPr>
+        <w:t>Flutter</w:t>
+      </w:r>
+      <w:r>
+        <w:rPr>
+          <w:rFonts w:eastAsia="Times New Roman" w:cs="Times New Roman"/>
+          <w:color w:val="000000"/>
+          <w:kern w:val="0"/>
+          <w:sz w:val="20"/>
+          <w:szCs w:val="20"/>
+          <w14:ligatures w14:val="none"/>
+        </w:rPr>
+        <w:t>, and delivering performant, user-centric solutions.</w:t>
       </w:r>
     </w:p>
     <w:p>
@@ -867,13 +977,24 @@
         </w:rPr>
         <w:t>), Jira</w:t>
       </w:r>
+      <w:r>
+        <w:rPr>
+          <w:rFonts w:eastAsia="Times New Roman" w:cs="Times New Roman"/>
+          <w:color w:val="000000"/>
+          <w:kern w:val="0"/>
+          <w:sz w:val="20"/>
+          <w:szCs w:val="20"/>
+          <w14:ligatures w14:val="none"/>
+        </w:rPr>
+        <w:t>, Claude Code</w:t>
+      </w:r>
     </w:p>
     <w:p>
       <w:pPr>
         <w:spacing w:before="240" w:after="0" w:line="240" w:lineRule="auto"/>
         <w:outlineLvl w:val="1"/>
         <w:rPr>
-          <w:rFonts w:eastAsia="Times New Roman" w:cs="Times New Roman" w:hint="eastAsia"/>
+          <w:rFonts w:eastAsia="Times New Roman" w:cs="Times New Roman"/>
           <w:b/>
           <w:bCs/>
           <w:color w:val="002060"/>
@@ -1301,7 +1422,29 @@
           <w:szCs w:val="20"/>
           <w14:ligatures w14:val="none"/>
         </w:rPr>
-        <w:t>Operated extensively in a Linux environment, leveraging Bash scripting and Git to support version control and CI/CD workflows.</w:t>
+        <w:t>Operated extensively in a Linux</w:t>
+      </w:r>
+      <w:r>
+        <w:rPr>
+          <w:rFonts w:eastAsia="Times New Roman" w:cs="Times New Roman"/>
+          <w:color w:val="000000"/>
+          <w:kern w:val="0"/>
+          <w:sz w:val="20"/>
+          <w:szCs w:val="20"/>
+          <w14:ligatures w14:val="none"/>
+        </w:rPr>
+        <w:t xml:space="preserve"> (Ubuntu, Fedora)</w:t>
+      </w:r>
+      <w:r>
+        <w:rPr>
+          <w:rFonts w:eastAsia="Times New Roman" w:cs="Times New Roman"/>
+          <w:color w:val="000000"/>
+          <w:kern w:val="0"/>
+          <w:sz w:val="20"/>
+          <w:szCs w:val="20"/>
+          <w14:ligatures w14:val="none"/>
+        </w:rPr>
+        <w:t xml:space="preserve"> environment, leveraging Bash scripting and Git to support version control and CI/CD workflows.</w:t>
       </w:r>
     </w:p>
     <w:p>
@@ -1330,7 +1473,33 @@
           <w:szCs w:val="21"/>
           <w14:ligatures w14:val="none"/>
         </w:rPr>
-        <w:t>Intern | Decoded</w:t>
+        <w:t>Junior Developer</w:t>
+      </w:r>
+      <w:r>
+        <w:rPr>
+          <w:rFonts w:eastAsia="Times New Roman" w:cs="Times New Roman"/>
+          <w:b/>
+          <w:bCs/>
+          <w:color w:val="002060"/>
+          <w:kern w:val="0"/>
+          <w:sz w:val="21"/>
+          <w:szCs w:val="21"/>
+          <w14:ligatures w14:val="none"/>
+        </w:rPr>
+        <w:t xml:space="preserve"> - Intern</w:t>
+      </w:r>
+      <w:r>
+        <w:rPr>
+          <w:rFonts w:eastAsia="Times New Roman" w:cs="Times New Roman"/>
+          <w:b/>
+          <w:bCs/>
+          <w:color w:val="002060"/>
+          <w:kern w:val="0"/>
+          <w:sz w:val="21"/>
+          <w:szCs w:val="21"/>
+          <w14:ligatures w14:val="none"/>
+        </w:rPr>
+        <w:t xml:space="preserve"> | Decoded</w:t>
       </w:r>
     </w:p>
     <w:p>
@@ -1486,7 +1655,62 @@
           <w:szCs w:val="20"/>
           <w14:ligatures w14:val="none"/>
         </w:rPr>
-        <w:t>Accelerated feature implementation and debugging by integrating AI-assisted IDEs (Cursor) into daily development processes.</w:t>
+        <w:t xml:space="preserve">Accelerated feature implementation, debugging, and onboarding by integrating AI-assisted IDEs </w:t>
+      </w:r>
+      <w:r>
+        <w:rPr>
+          <w:rFonts w:eastAsia="Times New Roman" w:cs="Times New Roman"/>
+          <w:color w:val="000000"/>
+          <w:kern w:val="0"/>
+          <w:sz w:val="20"/>
+          <w:szCs w:val="20"/>
+          <w14:ligatures w14:val="none"/>
+        </w:rPr>
+        <w:t xml:space="preserve">and tools </w:t>
+      </w:r>
+      <w:r>
+        <w:rPr>
+          <w:rFonts w:eastAsia="Times New Roman" w:cs="Times New Roman"/>
+          <w:color w:val="000000"/>
+          <w:kern w:val="0"/>
+          <w:sz w:val="20"/>
+          <w:szCs w:val="20"/>
+          <w14:ligatures w14:val="none"/>
+        </w:rPr>
+        <w:t>(Cursor</w:t>
+      </w:r>
+      <w:r>
+        <w:rPr>
+          <w:rFonts w:eastAsia="Times New Roman" w:cs="Times New Roman"/>
+          <w:color w:val="000000"/>
+          <w:kern w:val="0"/>
+          <w:sz w:val="20"/>
+          <w:szCs w:val="20"/>
+          <w14:ligatures w14:val="none"/>
+        </w:rPr>
+        <w:t>, Claude Code</w:t>
+      </w:r>
+      <w:r>
+        <w:rPr>
+          <w:rFonts w:eastAsia="Times New Roman" w:cs="Times New Roman"/>
+          <w:color w:val="000000"/>
+          <w:kern w:val="0"/>
+          <w:sz w:val="20"/>
+          <w:szCs w:val="20"/>
+          <w14:ligatures w14:val="none"/>
+        </w:rPr>
+        <w:t>) into daily development processes</w:t>
+      </w:r>
+      <w:r>
+        <w:rPr>
+          <w:rFonts w:eastAsia="Times New Roman" w:cs="Times New Roman"/>
+          <w:color w:val="000000"/>
+          <w:kern w:val="0"/>
+          <w:sz w:val="20"/>
+          <w:szCs w:val="20"/>
+          <w14:ligatures w14:val="none"/>
+        </w:rPr>
+        <w:t>.</w:t>
       </w:r>
     </w:p>
     <w:p>
@@ -1570,7 +1794,29 @@
           <w14:ligatures w14:val="none"/>
         </w:rPr>
         <w:lastRenderedPageBreak/>
-        <w:t xml:space="preserve">Architected and rolled out a SaaS-based MVP CRM system using TypeScript, Next.js, React, Python, </w:t>
+        <w:t>Architected and rolled out a SaaS-based MVP CRM system, demonstrating adaptability by rapidly executing across a diverse</w:t>
+      </w:r>
+      <w:r>
+        <w:rPr>
+          <w:rFonts w:eastAsia="Times New Roman" w:cs="Times New Roman"/>
+          <w:color w:val="000000"/>
+          <w:kern w:val="0"/>
+          <w:sz w:val="20"/>
+          <w:szCs w:val="20"/>
+          <w14:ligatures w14:val="none"/>
+        </w:rPr>
+        <w:t xml:space="preserve"> </w:t>
+      </w:r>
+      <w:r>
+        <w:rPr>
+          <w:rFonts w:eastAsia="Times New Roman" w:cs="Times New Roman"/>
+          <w:color w:val="000000"/>
+          <w:kern w:val="0"/>
+          <w:sz w:val="20"/>
+          <w:szCs w:val="20"/>
+          <w14:ligatures w14:val="none"/>
+        </w:rPr>
+        <w:t xml:space="preserve">tech stack (TypeScript, Next.js, Python, </w:t>
       </w:r>
       <w:proofErr w:type="spellStart"/>
       <w:r>
@@ -1594,7 +1840,7 @@
           <w:szCs w:val="20"/>
           <w14:ligatures w14:val="none"/>
         </w:rPr>
-        <w:t>, and PostgreSQL.</w:t>
+        <w:t>).</w:t>
       </w:r>
     </w:p>
     <w:p>
@@ -1785,7 +2031,29 @@
           <w:szCs w:val="20"/>
           <w14:ligatures w14:val="none"/>
         </w:rPr>
-        <w:t xml:space="preserve">Engineered a modular profile configuration system for core network probes using Python, </w:t>
+        <w:t>Engineered a modular profile configuration system for core network probes</w:t>
+      </w:r>
+      <w:r>
+        <w:rPr>
+          <w:rFonts w:eastAsia="Times New Roman" w:cs="Times New Roman"/>
+          <w:color w:val="000000"/>
+          <w:kern w:val="0"/>
+          <w:sz w:val="20"/>
+          <w:szCs w:val="20"/>
+          <w14:ligatures w14:val="none"/>
+        </w:rPr>
+        <w:t xml:space="preserve">, rapidly upskilling in </w:t>
+      </w:r>
+      <w:r>
+        <w:rPr>
+          <w:rFonts w:eastAsia="Times New Roman" w:cs="Times New Roman"/>
+          <w:color w:val="000000"/>
+          <w:kern w:val="0"/>
+          <w:sz w:val="20"/>
+          <w:szCs w:val="20"/>
+          <w14:ligatures w14:val="none"/>
+        </w:rPr>
+        <w:t xml:space="preserve">Python, </w:t>
       </w:r>
       <w:proofErr w:type="spellStart"/>
       <w:r>
@@ -2701,7 +2969,51 @@
           <w:szCs w:val="20"/>
           <w14:ligatures w14:val="none"/>
         </w:rPr>
-        <w:t xml:space="preserve">Engineered a "photo-to-recipe" pipeline using Firebase </w:t>
+        <w:t xml:space="preserve">Engineered a </w:t>
+      </w:r>
+      <w:r>
+        <w:rPr>
+          <w:rFonts w:eastAsia="Times New Roman" w:cs="Times New Roman"/>
+          <w:color w:val="000000"/>
+          <w:kern w:val="0"/>
+          <w:sz w:val="20"/>
+          <w:szCs w:val="20"/>
+          <w14:ligatures w14:val="none"/>
+        </w:rPr>
+        <w:t>“</w:t>
+      </w:r>
+      <w:r>
+        <w:rPr>
+          <w:rFonts w:eastAsia="Times New Roman" w:cs="Times New Roman"/>
+          <w:color w:val="000000"/>
+          <w:kern w:val="0"/>
+          <w:sz w:val="20"/>
+          <w:szCs w:val="20"/>
+          <w14:ligatures w14:val="none"/>
+        </w:rPr>
+        <w:t>photo-to-recipe</w:t>
+      </w:r>
+      <w:r>
+        <w:rPr>
+          <w:rFonts w:eastAsia="Times New Roman" w:cs="Times New Roman"/>
+          <w:color w:val="000000"/>
+          <w:kern w:val="0"/>
+          <w:sz w:val="20"/>
+          <w:szCs w:val="20"/>
+          <w14:ligatures w14:val="none"/>
+        </w:rPr>
+        <w:t>”</w:t>
+      </w:r>
+      <w:r>
+        <w:rPr>
+          <w:rFonts w:eastAsia="Times New Roman" w:cs="Times New Roman"/>
+          <w:color w:val="000000"/>
+          <w:kern w:val="0"/>
+          <w:sz w:val="20"/>
+          <w:szCs w:val="20"/>
+          <w14:ligatures w14:val="none"/>
+        </w:rPr>
+        <w:t xml:space="preserve"> pipeline using Firebase </w:t>
       </w:r>
       <w:proofErr w:type="spellStart"/>
       <w:r>

</xml_diff>